<commit_message>
feat(admin): refactor AdminPanel into tabs, add SubscriptionsManager with analytics
</commit_message>
<xml_diff>
--- a/env var nove.docx
+++ b/env var nove.docx
@@ -196,6 +196,469 @@
       <w:proofErr w:type="spellEnd"/>
       <w:r>
         <w:t>-audio</w:t>
+      </w:r>
+    </w:p>
+    <w:p/>
+    <w:p/>
+    <w:p/>
+    <w:p/>
+    <w:p/>
+    <w:p/>
+    <w:p/>
+    <w:p/>
+    <w:p/>
+    <w:p>
+      <w:r>
+        <w:lastRenderedPageBreak/>
+        <w:t># ----- SUPABASE (Databáza a Autentifikácia) -----</w:t>
+      </w:r>
+    </w:p>
+    <w:p>
+      <w:r>
+        <w:t xml:space="preserve"># Kde nájsť: </w:t>
+      </w:r>
+      <w:proofErr w:type="spellStart"/>
+      <w:r>
+        <w:t>Supabase</w:t>
+      </w:r>
+      <w:proofErr w:type="spellEnd"/>
+      <w:r>
+        <w:t xml:space="preserve"> </w:t>
+      </w:r>
+      <w:proofErr w:type="spellStart"/>
+      <w:r>
+        <w:t>Dashboard</w:t>
+      </w:r>
+      <w:proofErr w:type="spellEnd"/>
+      <w:r>
+        <w:t xml:space="preserve"> -&gt; Project </w:t>
+      </w:r>
+      <w:proofErr w:type="spellStart"/>
+      <w:r>
+        <w:t>Settings</w:t>
+      </w:r>
+      <w:proofErr w:type="spellEnd"/>
+      <w:r>
+        <w:t xml:space="preserve"> -&gt; API</w:t>
+      </w:r>
+    </w:p>
+    <w:p>
+      <w:r>
+        <w:t>NEXT_PUBLIC_SUPABASE_URL=https://(tvoj-projekt).supabase.co</w:t>
+      </w:r>
+    </w:p>
+    <w:p>
+      <w:r>
+        <w:t>NEXT_PUBLIC_SUPABASE_ANON_KEY=</w:t>
+      </w:r>
+      <w:proofErr w:type="spellStart"/>
+      <w:r>
+        <w:t>eyJ</w:t>
+      </w:r>
+      <w:proofErr w:type="spellEnd"/>
+      <w:r>
+        <w:t>...</w:t>
+      </w:r>
+    </w:p>
+    <w:p>
+      <w:r>
+        <w:t>SUPABASE_SERVICE_ROLE_KEY=</w:t>
+      </w:r>
+      <w:proofErr w:type="spellStart"/>
+      <w:r>
+        <w:t>eyJ</w:t>
+      </w:r>
+      <w:proofErr w:type="spellEnd"/>
+      <w:r>
+        <w:t>... (Dôležité! Toto zabezpečuje povolenia ako Admin!)</w:t>
+      </w:r>
+    </w:p>
+    <w:p/>
+    <w:p>
+      <w:r>
+        <w:t># ----- STRIPE (Platobná brána a Predplatné) -----</w:t>
+      </w:r>
+    </w:p>
+    <w:p>
+      <w:r>
+        <w:t xml:space="preserve"># Kde nájsť: </w:t>
+      </w:r>
+      <w:proofErr w:type="spellStart"/>
+      <w:r>
+        <w:t>Stripe</w:t>
+      </w:r>
+      <w:proofErr w:type="spellEnd"/>
+      <w:r>
+        <w:t xml:space="preserve"> </w:t>
+      </w:r>
+      <w:proofErr w:type="spellStart"/>
+      <w:r>
+        <w:t>Dashboard</w:t>
+      </w:r>
+      <w:proofErr w:type="spellEnd"/>
+      <w:r>
+        <w:t xml:space="preserve"> -&gt; </w:t>
+      </w:r>
+      <w:proofErr w:type="spellStart"/>
+      <w:r>
+        <w:t>Developers</w:t>
+      </w:r>
+      <w:proofErr w:type="spellEnd"/>
+      <w:r>
+        <w:t xml:space="preserve"> -&gt; API </w:t>
+      </w:r>
+      <w:proofErr w:type="spellStart"/>
+      <w:r>
+        <w:t>keys</w:t>
+      </w:r>
+      <w:proofErr w:type="spellEnd"/>
+      <w:r>
+        <w:t xml:space="preserve"> (Zapni si "Test </w:t>
+      </w:r>
+      <w:proofErr w:type="spellStart"/>
+      <w:r>
+        <w:t>mode</w:t>
+      </w:r>
+      <w:proofErr w:type="spellEnd"/>
+      <w:r>
+        <w:t>"!!!)</w:t>
+      </w:r>
+    </w:p>
+    <w:p>
+      <w:r>
+        <w:t>NEXT_PUBLIC_STRIPE_PUBLISHABLE_KEY=</w:t>
+      </w:r>
+      <w:proofErr w:type="spellStart"/>
+      <w:r>
+        <w:t>pk_test</w:t>
+      </w:r>
+      <w:proofErr w:type="spellEnd"/>
+      <w:r>
+        <w:t>_...</w:t>
+      </w:r>
+    </w:p>
+    <w:p>
+      <w:r>
+        <w:t>STRIPE_SECRET_KEY=</w:t>
+      </w:r>
+      <w:proofErr w:type="spellStart"/>
+      <w:r>
+        <w:t>sk_test</w:t>
+      </w:r>
+      <w:proofErr w:type="spellEnd"/>
+      <w:r>
+        <w:t>_...</w:t>
+      </w:r>
+    </w:p>
+    <w:p/>
+    <w:p>
+      <w:r>
+        <w:t xml:space="preserve"># Kde nájsť: </w:t>
+      </w:r>
+      <w:proofErr w:type="spellStart"/>
+      <w:r>
+        <w:t>Stripe</w:t>
+      </w:r>
+      <w:proofErr w:type="spellEnd"/>
+      <w:r>
+        <w:t xml:space="preserve"> </w:t>
+      </w:r>
+      <w:proofErr w:type="spellStart"/>
+      <w:r>
+        <w:t>Dashboard</w:t>
+      </w:r>
+      <w:proofErr w:type="spellEnd"/>
+      <w:r>
+        <w:t xml:space="preserve"> -&gt; </w:t>
+      </w:r>
+      <w:proofErr w:type="spellStart"/>
+      <w:r>
+        <w:t>Products</w:t>
+      </w:r>
+      <w:proofErr w:type="spellEnd"/>
+      <w:r>
+        <w:t xml:space="preserve"> -&gt; Vyber si svoj produkt -&gt; </w:t>
+      </w:r>
+      <w:proofErr w:type="spellStart"/>
+      <w:r>
+        <w:t>Three</w:t>
+      </w:r>
+      <w:proofErr w:type="spellEnd"/>
+      <w:r>
+        <w:t xml:space="preserve"> </w:t>
+      </w:r>
+      <w:proofErr w:type="spellStart"/>
+      <w:r>
+        <w:t>dots</w:t>
+      </w:r>
+      <w:proofErr w:type="spellEnd"/>
+      <w:r>
+        <w:t xml:space="preserve"> -&gt; "</w:t>
+      </w:r>
+      <w:proofErr w:type="spellStart"/>
+      <w:r>
+        <w:t>Copy</w:t>
+      </w:r>
+      <w:proofErr w:type="spellEnd"/>
+      <w:r>
+        <w:t xml:space="preserve"> </w:t>
+      </w:r>
+      <w:proofErr w:type="spellStart"/>
+      <w:r>
+        <w:t>Price</w:t>
+      </w:r>
+      <w:proofErr w:type="spellEnd"/>
+      <w:r>
+        <w:t xml:space="preserve"> ID"</w:t>
+      </w:r>
+    </w:p>
+    <w:p>
+      <w:r>
+        <w:t>STRIPE_PRICE_ID=</w:t>
+      </w:r>
+      <w:proofErr w:type="spellStart"/>
+      <w:r>
+        <w:t>price</w:t>
+      </w:r>
+      <w:proofErr w:type="spellEnd"/>
+      <w:r>
+        <w:t>_...</w:t>
+      </w:r>
+    </w:p>
+    <w:p/>
+    <w:p>
+      <w:r>
+        <w:t xml:space="preserve"># Kde nájsť: Získaš ho neskôr po nastavení </w:t>
+      </w:r>
+      <w:proofErr w:type="spellStart"/>
+      <w:r>
+        <w:t>Stripe</w:t>
+      </w:r>
+      <w:proofErr w:type="spellEnd"/>
+      <w:r>
+        <w:t xml:space="preserve"> </w:t>
+      </w:r>
+      <w:proofErr w:type="spellStart"/>
+      <w:r>
+        <w:t>Webhooku</w:t>
+      </w:r>
+      <w:proofErr w:type="spellEnd"/>
+      <w:r>
+        <w:t xml:space="preserve"> (na </w:t>
+      </w:r>
+      <w:proofErr w:type="spellStart"/>
+      <w:r>
+        <w:t>lokále</w:t>
+      </w:r>
+      <w:proofErr w:type="spellEnd"/>
+      <w:r>
+        <w:t xml:space="preserve"> cez "</w:t>
+      </w:r>
+      <w:proofErr w:type="spellStart"/>
+      <w:r>
+        <w:t>stripe</w:t>
+      </w:r>
+      <w:proofErr w:type="spellEnd"/>
+      <w:r>
+        <w:t xml:space="preserve"> </w:t>
+      </w:r>
+      <w:proofErr w:type="spellStart"/>
+      <w:r>
+        <w:t>listen</w:t>
+      </w:r>
+      <w:proofErr w:type="spellEnd"/>
+      <w:r>
+        <w:t>")</w:t>
+      </w:r>
+    </w:p>
+    <w:p>
+      <w:r>
+        <w:t xml:space="preserve"># Ak nemáš, na testovanie </w:t>
+      </w:r>
+      <w:proofErr w:type="spellStart"/>
+      <w:r>
+        <w:t>frontend</w:t>
+      </w:r>
+      <w:proofErr w:type="spellEnd"/>
+      <w:r>
+        <w:t xml:space="preserve"> </w:t>
+      </w:r>
+      <w:proofErr w:type="spellStart"/>
+      <w:r>
+        <w:t>checkoutu</w:t>
+      </w:r>
+      <w:proofErr w:type="spellEnd"/>
+      <w:r>
+        <w:t xml:space="preserve"> môže ostať dočasne prázdne, ale nepôjde automatický zápis DB</w:t>
+      </w:r>
+    </w:p>
+    <w:p>
+      <w:r>
+        <w:t>STRIPE_WEBHOOK_SECRET=</w:t>
+      </w:r>
+      <w:proofErr w:type="spellStart"/>
+      <w:r>
+        <w:t>whsec</w:t>
+      </w:r>
+      <w:proofErr w:type="spellEnd"/>
+      <w:r>
+        <w:t>_...</w:t>
+      </w:r>
+    </w:p>
+    <w:p/>
+    <w:p>
+      <w:r>
+        <w:t># ----- CLOUDFLARE R2 (Trezor na Audio súbory) -----</w:t>
+      </w:r>
+    </w:p>
+    <w:p>
+      <w:r>
+        <w:t xml:space="preserve"># Kde nájsť: </w:t>
+      </w:r>
+      <w:proofErr w:type="spellStart"/>
+      <w:r>
+        <w:t>Cloudflare</w:t>
+      </w:r>
+      <w:proofErr w:type="spellEnd"/>
+      <w:r>
+        <w:t xml:space="preserve"> </w:t>
+      </w:r>
+      <w:proofErr w:type="spellStart"/>
+      <w:r>
+        <w:t>Dashboard</w:t>
+      </w:r>
+      <w:proofErr w:type="spellEnd"/>
+      <w:r>
+        <w:t xml:space="preserve"> -&gt; R2 -&gt; </w:t>
+      </w:r>
+      <w:proofErr w:type="spellStart"/>
+      <w:r>
+        <w:t>Manage</w:t>
+      </w:r>
+      <w:proofErr w:type="spellEnd"/>
+      <w:r>
+        <w:t xml:space="preserve"> R2 API </w:t>
+      </w:r>
+      <w:proofErr w:type="spellStart"/>
+      <w:r>
+        <w:t>Tokens</w:t>
+      </w:r>
+      <w:proofErr w:type="spellEnd"/>
+      <w:r>
+        <w:t xml:space="preserve"> -&gt; Vytvoriť Token (Daj mu plné oprávnenie na čítanie "</w:t>
+      </w:r>
+      <w:proofErr w:type="spellStart"/>
+      <w:r>
+        <w:t>Read</w:t>
+      </w:r>
+      <w:proofErr w:type="spellEnd"/>
+      <w:r>
+        <w:t>")</w:t>
+      </w:r>
+    </w:p>
+    <w:p>
+      <w:r>
+        <w:t>R2_ACCESS_KEY_ID=...</w:t>
+      </w:r>
+    </w:p>
+    <w:p>
+      <w:r>
+        <w:t>R2_SECRET_ACCESS_KEY=...</w:t>
+      </w:r>
+    </w:p>
+    <w:p>
+      <w:r>
+        <w:t xml:space="preserve"># Kde nájsť </w:t>
+      </w:r>
+      <w:proofErr w:type="spellStart"/>
+      <w:r>
+        <w:t>Endpoint</w:t>
+      </w:r>
+      <w:proofErr w:type="spellEnd"/>
+      <w:r>
+        <w:t xml:space="preserve">: V R2 </w:t>
+      </w:r>
+      <w:proofErr w:type="spellStart"/>
+      <w:r>
+        <w:t>Dashboarde</w:t>
+      </w:r>
+      <w:proofErr w:type="spellEnd"/>
+      <w:r>
+        <w:t xml:space="preserve"> vpravo je "</w:t>
+      </w:r>
+      <w:proofErr w:type="spellStart"/>
+      <w:r>
+        <w:t>Account</w:t>
+      </w:r>
+      <w:proofErr w:type="spellEnd"/>
+      <w:r>
+        <w:t xml:space="preserve"> ID". Doplň svoje ID do tohoto tvaru:</w:t>
+      </w:r>
+    </w:p>
+    <w:p>
+      <w:r>
+        <w:t>R2_ENDPOINT=https://&lt;TVOJE_ACCOUNT_ID&gt;.r2.cloudflarestorage.com</w:t>
+      </w:r>
+    </w:p>
+    <w:p>
+      <w:r>
+        <w:t xml:space="preserve"># Názov </w:t>
+      </w:r>
+      <w:proofErr w:type="spellStart"/>
+      <w:r>
+        <w:t>bucketu</w:t>
+      </w:r>
+      <w:proofErr w:type="spellEnd"/>
+      <w:r>
+        <w:t xml:space="preserve">, ktorý si si vytvoril v </w:t>
+      </w:r>
+      <w:proofErr w:type="spellStart"/>
+      <w:r>
+        <w:t>Cloudflare</w:t>
+      </w:r>
+      <w:proofErr w:type="spellEnd"/>
+      <w:r>
+        <w:t xml:space="preserve"> R2</w:t>
+      </w:r>
+    </w:p>
+    <w:p>
+      <w:r>
+        <w:t>R2_BUCKET_NAME=</w:t>
+      </w:r>
+      <w:proofErr w:type="spellStart"/>
+      <w:r>
+        <w:t>mindbanger</w:t>
+      </w:r>
+      <w:proofErr w:type="spellEnd"/>
+      <w:r>
+        <w:t>-audio</w:t>
+      </w:r>
+    </w:p>
+    <w:p/>
+    <w:p>
+      <w:r>
+        <w:t># ----- APLIKÁCIA (Pre presmerovania z platieb a emailov) -----</w:t>
+      </w:r>
+    </w:p>
+    <w:p>
+      <w:r>
+        <w:t># Kým robíme a testujeme u teba na PC:</w:t>
+      </w:r>
+    </w:p>
+    <w:p>
+      <w:r>
+        <w:lastRenderedPageBreak/>
+        <w:t>NEXT_PUBLIC_SITE_URL=http://localhost:3000</w:t>
+      </w:r>
+    </w:p>
+    <w:p>
+      <w:r>
+        <w:t># Keď to nasadíš ostrým, tak to zmeníš na:</w:t>
+      </w:r>
+    </w:p>
+    <w:p>
+      <w:r>
+        <w:t># NEXT_PUBLIC_SITE_URL=https://mindbanger.com</w:t>
       </w:r>
     </w:p>
     <w:sectPr>

</xml_diff>